<commit_message>
Roadmap: steps 1-5 done, History Units 3 and 4 next
</commit_message>
<xml_diff>
--- a/docs/Pet Town Question Bank Roadmap.docx
+++ b/docs/Pet Town Question Bank Roadmap.docx
@@ -18,7 +18,7 @@
         <w:rPr>
           <w:color w:val="666666"/>
         </w:rPr>
-        <w:t xml:space="preserve">Updated October 7, 2026 (evening) · Andy Mattick</w:t>
+        <w:t xml:space="preserve">Updated October 8, 2026 · Andy Mattick</w:t>
       </w:r>
     </w:p>
     <w:p>
@@ -120,7 +120,7 @@
         <w:spacing w:after="120"/>
       </w:pPr>
       <w:r>
-        <w:t xml:space="preserve">Counts come from the current repo (October 7, 2026).</w:t>
+        <w:t xml:space="preserve">Counts come from the current repo (October 8, 2026).</w:t>
       </w:r>
     </w:p>
     <w:tbl>
@@ -369,7 +369,7 @@
           </w:tcPr>
           <w:p>
             <w:r>
-              <w:t xml:space="preserve">History Unit 1</w:t>
+              <w:t xml:space="preserve">History Units 1 and 2</w:t>
             </w:r>
           </w:p>
         </w:tc>
@@ -391,7 +391,7 @@
           </w:tcPr>
           <w:p>
             <w:r>
-              <w:t xml:space="preserve">4</w:t>
+              <w:t xml:space="preserve">9</w:t>
             </w:r>
           </w:p>
         </w:tc>
@@ -435,7 +435,7 @@
           </w:tcPr>
           <w:p>
             <w:r>
-              <w:t xml:space="preserve">Done. 40 new questions applied; the original 16 tagged.</w:t>
+              <w:t xml:space="preserve">Done. 90 new questions applied (40 in Unit 1, 50 in Unit 2); all originals tagged, and 19 Unit 2 originals with a too-long right answer fixed.</w:t>
             </w:r>
           </w:p>
         </w:tc>
@@ -462,7 +462,7 @@
           </w:tcPr>
           <w:p>
             <w:r>
-              <w:t xml:space="preserve">History Units 2 to 4</w:t>
+              <w:t xml:space="preserve">History Units 3 and 4</w:t>
             </w:r>
           </w:p>
         </w:tc>
@@ -484,7 +484,7 @@
           </w:tcPr>
           <w:p>
             <w:r>
-              <w:t xml:space="preserve">26</w:t>
+              <w:t xml:space="preserve">21</w:t>
             </w:r>
           </w:p>
         </w:tc>
@@ -868,10 +868,10 @@
           <w:b/>
           <w:bCs/>
         </w:rPr>
-        <w:t xml:space="preserve">History Unit 1: </w:t>
-      </w:r>
-      <w:r>
-        <w:t xml:space="preserve">4 lessons, 40 new questions. Done.</w:t>
+        <w:t xml:space="preserve">History Units 1 and 2: </w:t>
+      </w:r>
+      <w:r>
+        <w:t xml:space="preserve">9 lessons, 90 new questions, plus fixes to Unit 2’s long right answers. Done.</w:t>
       </w:r>
     </w:p>
     <w:p>
@@ -888,10 +888,10 @@
           <w:b/>
           <w:bCs/>
         </w:rPr>
-        <w:t xml:space="preserve">History Units 2 to 4: </w:t>
-      </w:r>
-      <w:r>
-        <w:t xml:space="preserve">26 lessons, about 260 new questions, one unit per script. Also fix the original questions where the right answer is the longest choice.</w:t>
+        <w:t xml:space="preserve">History Units 3 and 4: </w:t>
+      </w:r>
+      <w:r>
+        <w:t xml:space="preserve">21 lessons, about 210 new questions, one unit per script. Also fix the original questions where the right answer is the longest choice.</w:t>
       </w:r>
     </w:p>
     <w:p>
@@ -1073,7 +1073,7 @@
         <w:spacing w:after="120"/>
       </w:pPr>
       <w:r>
-        <w:t xml:space="preserve">Spec: docs/LESSON-CONTENT.md. Built by the Codespace assistant from that spec.</w:t>
+        <w:t xml:space="preserve">Done October 8, 2026. Spec: LESSON-CONTENT.md. Run the migration (supabase/migrations/20261007000000_lesson_content.sql) in Supabase before teachers use the tab.</w:t>
       </w:r>
     </w:p>
     <w:p>
@@ -1331,7 +1331,7 @@
         <w:spacing w:after="120"/>
       </w:pPr>
       <w:r>
-        <w:t xml:space="preserve">Built-in questions get a stable id from their text, so the existing banks don’t need editing. The banks move into a shared file so the teacher app can show them; the spec requires an exact cut-and-paste with a before-and-after question count check.</w:t>
+        <w:t xml:space="preserve">Built-in questions get a stable id from their prompt and correct answer (a few lessons repeat a prompt), so the existing banks don’t need editing. The banks moved unchanged into src/shared/questionBanks.js so the teacher app can show them; scripts/question-counts.mjs confirmed all 62 lessons and 574 questions match.</w:t>
       </w:r>
     </w:p>
     <w:p>
@@ -1921,7 +1921,7 @@
           </w:tcPr>
           <w:p>
             <w:r>
-              <w:t xml:space="preserve">Done; commit pending</w:t>
+              <w:t xml:space="preserve">Done</w:t>
             </w:r>
           </w:p>
         </w:tc>
@@ -2014,7 +2014,7 @@
           </w:tcPr>
           <w:p>
             <w:r>
-              <w:t xml:space="preserve">Done; commit pending</w:t>
+              <w:t xml:space="preserve">Done</w:t>
             </w:r>
           </w:p>
         </w:tc>
@@ -2107,7 +2107,7 @@
           </w:tcPr>
           <w:p>
             <w:r>
-              <w:t xml:space="preserve">Done; commit pending</w:t>
+              <w:t xml:space="preserve">Done</w:t>
             </w:r>
           </w:p>
         </w:tc>
@@ -2156,7 +2156,7 @@
           </w:tcPr>
           <w:p>
             <w:r>
-              <w:t xml:space="preserve">Lesson links and question editing, including teacher veto (docs/LESSON-CONTENT.md)</w:t>
+              <w:t xml:space="preserve">Lesson links and question editing, including teacher veto (LESSON-CONTENT.md)</w:t>
             </w:r>
           </w:p>
         </w:tc>
@@ -2200,7 +2200,7 @@
           </w:tcPr>
           <w:p>
             <w:r>
-              <w:t xml:space="preserve">Spec ready</w:t>
+              <w:t xml:space="preserve">Done</w:t>
             </w:r>
           </w:p>
         </w:tc>
@@ -2293,7 +2293,7 @@
           </w:tcPr>
           <w:p>
             <w:r>
-              <w:t xml:space="preserve">Next</w:t>
+              <w:t xml:space="preserve">Done</w:t>
             </w:r>
           </w:p>
         </w:tc>
@@ -2386,7 +2386,7 @@
           </w:tcPr>
           <w:p>
             <w:r>
-              <w:t xml:space="preserve">Not started</w:t>
+              <w:t xml:space="preserve">Next</w:t>
             </w:r>
           </w:p>
         </w:tc>

</xml_diff>

<commit_message>
adding new video formats
</commit_message>
<xml_diff>
--- a/docs/Pet Town Question Bank Roadmap.docx
+++ b/docs/Pet Town Question Bank Roadmap.docx
@@ -7,7 +7,7 @@
         <w:pStyle w:val="Title"/>
       </w:pPr>
       <w:r>
-        <w:t xml:space="preserve">Pet Town Question Bank Roadmap</w:t>
+        <w:t xml:space="preserve">Pet Town Question Bank and Lesson Video Roadmap</w:t>
       </w:r>
     </w:p>
     <w:p>
@@ -18,7 +18,7 @@
         <w:rPr>
           <w:color w:val="666666"/>
         </w:rPr>
-        <w:t xml:space="preserve">Updated October 9, 2026 · Andy Mattick</w:t>
+        <w:t xml:space="preserve">Updated October 10, 2026 · Andy Mattick</w:t>
       </w:r>
     </w:p>
     <w:p>
@@ -120,7 +120,7 @@
         <w:spacing w:after="120"/>
       </w:pPr>
       <w:r>
-        <w:t xml:space="preserve">All ten steps are built. Steps 8 to 10 are patches in docs/ (step8-copy-prompt-import, step9-miss-rates, step10-khan-check) waiting to be applied in that order, followed by the khan_results migration. Counts come from the current repo (October 9, 2026).</w:t>
+        <w:t xml:space="preserve">Steps 1 to 12 are done and in the repo (October 10, 2026), including the khan_results migration. Next is Phase 6: our own lesson videos in place of Khan’s (steps 13 to 17).</w:t>
       </w:r>
     </w:p>
     <w:tbl>
@@ -1691,6 +1691,163 @@
         <w:spacing w:after="120" w:before="300"/>
       </w:pPr>
       <w:r>
+        <w:t xml:space="preserve">Phase 6: Pet Town lesson videos (the video engine)</w:t>
+      </w:r>
+    </w:p>
+    <w:p>
+      <w:pPr>
+        <w:spacing w:after="120"/>
+      </w:pPr>
+      <w:r>
+        <w:t xml:space="preserve">Replace Khan’s videos with our own, in Khan’s order. Khan keeps two jobs only: the order of lessons, and the Khan unit test check as the outside benchmark. Spec: LESSON-VIDEOS.md.</w:t>
+      </w:r>
+    </w:p>
+    <w:p>
+      <w:pPr>
+        <w:pStyle w:val="ListParagraph"/>
+        <w:numPr>
+          <w:ilvl w:val="0"/>
+          <w:numId w:val="2"/>
+        </w:numPr>
+        <w:spacing w:after="60"/>
+      </w:pPr>
+      <w:r>
+        <w:rPr>
+          <w:b/>
+          <w:bCs/>
+        </w:rPr>
+        <w:t xml:space="preserve">Two waves per lesson.</w:t>
+      </w:r>
+      <w:r>
+        <w:t xml:space="preserve"> First a placeholder, built automatically from a lesson script (narrated slides with Pet Town’s own pictures, a free offline computer voice and captions). Then Andy records the lesson himself from the same script, and it replaces the placeholder in place.</w:t>
+      </w:r>
+    </w:p>
+    <w:p>
+      <w:pPr>
+        <w:pStyle w:val="ListParagraph"/>
+        <w:numPr>
+          <w:ilvl w:val="0"/>
+          <w:numId w:val="2"/>
+        </w:numPr>
+        <w:spacing w:after="60"/>
+      </w:pPr>
+      <w:r>
+        <w:rPr>
+          <w:b/>
+          <w:bCs/>
+        </w:rPr>
+        <w:t xml:space="preserve">About 110 videos.</w:t>
+      </w:r>
+      <w:r>
+        <w:t xml:space="preserve"> 49 for English, History and Biology (one per block or extra reading), and about 60 for math (one per station, with short clips only where a skill needs its own example).</w:t>
+      </w:r>
+    </w:p>
+    <w:p>
+      <w:pPr>
+        <w:pStyle w:val="ListParagraph"/>
+        <w:numPr>
+          <w:ilvl w:val="0"/>
+          <w:numId w:val="2"/>
+        </w:numPr>
+        <w:spacing w:after="60"/>
+      </w:pPr>
+      <w:r>
+        <w:rPr>
+          <w:b/>
+          <w:bCs/>
+        </w:rPr>
+        <w:t xml:space="preserve">Lesson catalog.</w:t>
+      </w:r>
+      <w:r>
+        <w:t xml:space="preserve"> One file, src/shared/lessonVideos.js, lists every lesson in Khan order with its script and YouTube video. A lesson without a video keeps its Khan link; a teacher’s own link still wins for that class.</w:t>
+      </w:r>
+    </w:p>
+    <w:p>
+      <w:pPr>
+        <w:pStyle w:val="ListParagraph"/>
+        <w:numPr>
+          <w:ilvl w:val="0"/>
+          <w:numId w:val="2"/>
+        </w:numPr>
+        <w:spacing w:after="60"/>
+      </w:pPr>
+      <w:r>
+        <w:rPr>
+          <w:b/>
+          <w:bCs/>
+        </w:rPr>
+        <w:t xml:space="preserve">Scripts written in chat.</w:t>
+      </w:r>
+      <w:r>
+        <w:t xml:space="preserve"> Like the question banks: original wording (never Khan’s transcripts), 3 to 6 minutes, 6th grade reading level, ending with a check question from the lesson’s bank. Reviewed by Andy before building.</w:t>
+      </w:r>
+    </w:p>
+    <w:p>
+      <w:pPr>
+        <w:pStyle w:val="ListParagraph"/>
+        <w:numPr>
+          <w:ilvl w:val="0"/>
+          <w:numId w:val="2"/>
+        </w:numPr>
+        <w:spacing w:after="60"/>
+      </w:pPr>
+      <w:r>
+        <w:rPr>
+          <w:b/>
+          <w:bCs/>
+        </w:rPr>
+        <w:t xml:space="preserve">Placeholder builder.</w:t>
+      </w:r>
+      <w:r>
+        <w:t xml:space="preserve"> scripts/build-video.mjs runs in the Codespace with no account or API key: slides rendered in Chromium (math slides use Pet Town’s own number lines and area models), Piper voice, ffmpeg, captions.</w:t>
+      </w:r>
+    </w:p>
+    <w:p>
+      <w:pPr>
+        <w:pStyle w:val="ListParagraph"/>
+        <w:numPr>
+          <w:ilvl w:val="0"/>
+          <w:numId w:val="2"/>
+        </w:numPr>
+        <w:spacing w:after="60"/>
+      </w:pPr>
+      <w:r>
+        <w:rPr>
+          <w:b/>
+          <w:bCs/>
+        </w:rPr>
+        <w:t xml:space="preserve">YouTube, unlisted, played inside Pet Town.</w:t>
+      </w:r>
+      <w:r>
+        <w:t xml:space="preserve"> Students press Watch the lesson and never leave Pet Town; the Khan link is hidden once a lesson has a video. Watching 80% marks the lesson watched in the student’s save.</w:t>
+      </w:r>
+    </w:p>
+    <w:p>
+      <w:pPr>
+        <w:pStyle w:val="ListParagraph"/>
+        <w:numPr>
+          <w:ilvl w:val="0"/>
+          <w:numId w:val="2"/>
+        </w:numPr>
+        <w:spacing w:after="60"/>
+      </w:pPr>
+      <w:r>
+        <w:rPr>
+          <w:b/>
+          <w:bCs/>
+        </w:rPr>
+        <w:t xml:space="preserve">Still open:</w:t>
+      </w:r>
+      <w:r>
+        <w:t xml:space="preserve"> a free offline voice or a paid, more natural one (used only while building); on camera or voice over screen for recordings; YouTube links or MP4 files for the TPT version.</w:t>
+      </w:r>
+    </w:p>
+    <w:p>
+      <w:pPr>
+        <w:pStyle w:val="Heading1"/>
+        <w:spacing w:after="120" w:before="300"/>
+      </w:pPr>
+      <w:r>
         <w:t xml:space="preserve">Order of work</w:t>
       </w:r>
     </w:p>
@@ -2851,7 +3008,7 @@
           </w:tcPr>
           <w:p>
             <w:r>
-              <w:t xml:space="preserve">Next</w:t>
+              <w:t xml:space="preserve">Done</w:t>
             </w:r>
           </w:p>
         </w:tc>
@@ -2944,7 +3101,472 @@
           </w:tcPr>
           <w:p>
             <w:r>
-              <w:t xml:space="preserve">Next</w:t>
+              <w:t xml:space="preserve">Done</w:t>
+            </w:r>
+          </w:p>
+        </w:tc>
+      </w:tr>
+      <w:tr>
+        <w:trPr>
+          <w:tblHeader w:val="false"/>
+        </w:trPr>
+        <w:tc>
+          <w:tcPr>
+            <w:tcW w:type="dxa" w:w="600"/>
+            <w:tcBorders>
+              <w:top w:val="single" w:color="BFBFBF" w:sz="4"/>
+              <w:left w:val="single" w:color="BFBFBF" w:sz="4"/>
+              <w:bottom w:val="single" w:color="BFBFBF" w:sz="4"/>
+              <w:right w:val="single" w:color="BFBFBF" w:sz="4"/>
+            </w:tcBorders>
+            <w:tcMar>
+              <w:top w:type="dxa" w:w="60"/>
+              <w:left w:type="dxa" w:w="100"/>
+              <w:bottom w:type="dxa" w:w="60"/>
+              <w:right w:type="dxa" w:w="100"/>
+            </w:tcMar>
+          </w:tcPr>
+          <w:p>
+            <w:r>
+              <w:t xml:space="preserve">13</w:t>
+            </w:r>
+          </w:p>
+        </w:tc>
+        <w:tc>
+          <w:tcPr>
+            <w:tcW w:type="dxa" w:w="5160"/>
+            <w:tcBorders>
+              <w:top w:val="single" w:color="BFBFBF" w:sz="4"/>
+              <w:left w:val="single" w:color="BFBFBF" w:sz="4"/>
+              <w:bottom w:val="single" w:color="BFBFBF" w:sz="4"/>
+              <w:right w:val="single" w:color="BFBFBF" w:sz="4"/>
+            </w:tcBorders>
+            <w:tcMar>
+              <w:top w:type="dxa" w:w="60"/>
+              <w:left w:type="dxa" w:w="100"/>
+              <w:bottom w:type="dxa" w:w="60"/>
+              <w:right w:type="dxa" w:w="100"/>
+            </w:tcMar>
+          </w:tcPr>
+          <w:p>
+            <w:r>
+              <w:t xml:space="preserve">Lesson video catalog and the in-Pet-Town player (Khan link hidden when a video exists, watched tracking)</w:t>
+            </w:r>
+          </w:p>
+        </w:tc>
+        <w:tc>
+          <w:tcPr>
+            <w:tcW w:type="dxa" w:w="1600"/>
+            <w:tcBorders>
+              <w:top w:val="single" w:color="BFBFBF" w:sz="4"/>
+              <w:left w:val="single" w:color="BFBFBF" w:sz="4"/>
+              <w:bottom w:val="single" w:color="BFBFBF" w:sz="4"/>
+              <w:right w:val="single" w:color="BFBFBF" w:sz="4"/>
+            </w:tcBorders>
+            <w:tcMar>
+              <w:top w:type="dxa" w:w="60"/>
+              <w:left w:type="dxa" w:w="100"/>
+              <w:bottom w:type="dxa" w:w="60"/>
+              <w:right w:type="dxa" w:w="100"/>
+            </w:tcMar>
+          </w:tcPr>
+          <w:p>
+            <w:r>
+              <w:t xml:space="preserve">6</w:t>
+            </w:r>
+          </w:p>
+        </w:tc>
+        <w:tc>
+          <w:tcPr>
+            <w:tcW w:type="dxa" w:w="2000"/>
+            <w:tcBorders>
+              <w:top w:val="single" w:color="BFBFBF" w:sz="4"/>
+              <w:left w:val="single" w:color="BFBFBF" w:sz="4"/>
+              <w:bottom w:val="single" w:color="BFBFBF" w:sz="4"/>
+              <w:right w:val="single" w:color="BFBFBF" w:sz="4"/>
+            </w:tcBorders>
+            <w:tcMar>
+              <w:top w:type="dxa" w:w="60"/>
+              <w:left w:type="dxa" w:w="100"/>
+              <w:bottom w:type="dxa" w:w="60"/>
+              <w:right w:type="dxa" w:w="100"/>
+            </w:tcMar>
+          </w:tcPr>
+          <w:p>
+            <w:r>
+              <w:t xml:space="preserve">Not started</w:t>
+            </w:r>
+          </w:p>
+        </w:tc>
+      </w:tr>
+      <w:tr>
+        <w:trPr>
+          <w:tblHeader w:val="false"/>
+        </w:trPr>
+        <w:tc>
+          <w:tcPr>
+            <w:tcW w:type="dxa" w:w="600"/>
+            <w:tcBorders>
+              <w:top w:val="single" w:color="BFBFBF" w:sz="4"/>
+              <w:left w:val="single" w:color="BFBFBF" w:sz="4"/>
+              <w:bottom w:val="single" w:color="BFBFBF" w:sz="4"/>
+              <w:right w:val="single" w:color="BFBFBF" w:sz="4"/>
+            </w:tcBorders>
+            <w:tcMar>
+              <w:top w:type="dxa" w:w="60"/>
+              <w:left w:type="dxa" w:w="100"/>
+              <w:bottom w:type="dxa" w:w="60"/>
+              <w:right w:type="dxa" w:w="100"/>
+            </w:tcMar>
+          </w:tcPr>
+          <w:p>
+            <w:r>
+              <w:t xml:space="preserve">14</w:t>
+            </w:r>
+          </w:p>
+        </w:tc>
+        <w:tc>
+          <w:tcPr>
+            <w:tcW w:type="dxa" w:w="5160"/>
+            <w:tcBorders>
+              <w:top w:val="single" w:color="BFBFBF" w:sz="4"/>
+              <w:left w:val="single" w:color="BFBFBF" w:sz="4"/>
+              <w:bottom w:val="single" w:color="BFBFBF" w:sz="4"/>
+              <w:right w:val="single" w:color="BFBFBF" w:sz="4"/>
+            </w:tcBorders>
+            <w:tcMar>
+              <w:top w:type="dxa" w:w="60"/>
+              <w:left w:type="dxa" w:w="100"/>
+              <w:bottom w:type="dxa" w:w="60"/>
+              <w:right w:type="dxa" w:w="100"/>
+            </w:tcMar>
+          </w:tcPr>
+          <w:p>
+            <w:r>
+              <w:t xml:space="preserve">Script format, placeholder builder and status report; prototype one Biology lesson and one math station, then decide if quality is good enough</w:t>
+            </w:r>
+          </w:p>
+        </w:tc>
+        <w:tc>
+          <w:tcPr>
+            <w:tcW w:type="dxa" w:w="1600"/>
+            <w:tcBorders>
+              <w:top w:val="single" w:color="BFBFBF" w:sz="4"/>
+              <w:left w:val="single" w:color="BFBFBF" w:sz="4"/>
+              <w:bottom w:val="single" w:color="BFBFBF" w:sz="4"/>
+              <w:right w:val="single" w:color="BFBFBF" w:sz="4"/>
+            </w:tcBorders>
+            <w:tcMar>
+              <w:top w:type="dxa" w:w="60"/>
+              <w:left w:type="dxa" w:w="100"/>
+              <w:bottom w:type="dxa" w:w="60"/>
+              <w:right w:type="dxa" w:w="100"/>
+            </w:tcMar>
+          </w:tcPr>
+          <w:p>
+            <w:r>
+              <w:t xml:space="preserve">6</w:t>
+            </w:r>
+          </w:p>
+        </w:tc>
+        <w:tc>
+          <w:tcPr>
+            <w:tcW w:type="dxa" w:w="2000"/>
+            <w:tcBorders>
+              <w:top w:val="single" w:color="BFBFBF" w:sz="4"/>
+              <w:left w:val="single" w:color="BFBFBF" w:sz="4"/>
+              <w:bottom w:val="single" w:color="BFBFBF" w:sz="4"/>
+              <w:right w:val="single" w:color="BFBFBF" w:sz="4"/>
+            </w:tcBorders>
+            <w:tcMar>
+              <w:top w:type="dxa" w:w="60"/>
+              <w:left w:type="dxa" w:w="100"/>
+              <w:bottom w:type="dxa" w:w="60"/>
+              <w:right w:type="dxa" w:w="100"/>
+            </w:tcMar>
+          </w:tcPr>
+          <w:p>
+            <w:r>
+              <w:t xml:space="preserve">Not started</w:t>
+            </w:r>
+          </w:p>
+        </w:tc>
+      </w:tr>
+      <w:tr>
+        <w:trPr>
+          <w:tblHeader w:val="false"/>
+        </w:trPr>
+        <w:tc>
+          <w:tcPr>
+            <w:tcW w:type="dxa" w:w="600"/>
+            <w:tcBorders>
+              <w:top w:val="single" w:color="BFBFBF" w:sz="4"/>
+              <w:left w:val="single" w:color="BFBFBF" w:sz="4"/>
+              <w:bottom w:val="single" w:color="BFBFBF" w:sz="4"/>
+              <w:right w:val="single" w:color="BFBFBF" w:sz="4"/>
+            </w:tcBorders>
+            <w:tcMar>
+              <w:top w:type="dxa" w:w="60"/>
+              <w:left w:type="dxa" w:w="100"/>
+              <w:bottom w:type="dxa" w:w="60"/>
+              <w:right w:type="dxa" w:w="100"/>
+            </w:tcMar>
+          </w:tcPr>
+          <w:p>
+            <w:r>
+              <w:t xml:space="preserve">15</w:t>
+            </w:r>
+          </w:p>
+        </w:tc>
+        <w:tc>
+          <w:tcPr>
+            <w:tcW w:type="dxa" w:w="5160"/>
+            <w:tcBorders>
+              <w:top w:val="single" w:color="BFBFBF" w:sz="4"/>
+              <w:left w:val="single" w:color="BFBFBF" w:sz="4"/>
+              <w:bottom w:val="single" w:color="BFBFBF" w:sz="4"/>
+              <w:right w:val="single" w:color="BFBFBF" w:sz="4"/>
+            </w:tcBorders>
+            <w:tcMar>
+              <w:top w:type="dxa" w:w="60"/>
+              <w:left w:type="dxa" w:w="100"/>
+              <w:bottom w:type="dxa" w:w="60"/>
+              <w:right w:type="dxa" w:w="100"/>
+            </w:tcMar>
+          </w:tcPr>
+          <w:p>
+            <w:r>
+              <w:t xml:space="preserve">Lesson scripts and placeholder videos, unit by unit (Biology, History, English, then math stations)</w:t>
+            </w:r>
+          </w:p>
+        </w:tc>
+        <w:tc>
+          <w:tcPr>
+            <w:tcW w:type="dxa" w:w="1600"/>
+            <w:tcBorders>
+              <w:top w:val="single" w:color="BFBFBF" w:sz="4"/>
+              <w:left w:val="single" w:color="BFBFBF" w:sz="4"/>
+              <w:bottom w:val="single" w:color="BFBFBF" w:sz="4"/>
+              <w:right w:val="single" w:color="BFBFBF" w:sz="4"/>
+            </w:tcBorders>
+            <w:tcMar>
+              <w:top w:type="dxa" w:w="60"/>
+              <w:left w:type="dxa" w:w="100"/>
+              <w:bottom w:type="dxa" w:w="60"/>
+              <w:right w:type="dxa" w:w="100"/>
+            </w:tcMar>
+          </w:tcPr>
+          <w:p>
+            <w:r>
+              <w:t xml:space="preserve">6</w:t>
+            </w:r>
+          </w:p>
+        </w:tc>
+        <w:tc>
+          <w:tcPr>
+            <w:tcW w:type="dxa" w:w="2000"/>
+            <w:tcBorders>
+              <w:top w:val="single" w:color="BFBFBF" w:sz="4"/>
+              <w:left w:val="single" w:color="BFBFBF" w:sz="4"/>
+              <w:bottom w:val="single" w:color="BFBFBF" w:sz="4"/>
+              <w:right w:val="single" w:color="BFBFBF" w:sz="4"/>
+            </w:tcBorders>
+            <w:tcMar>
+              <w:top w:type="dxa" w:w="60"/>
+              <w:left w:type="dxa" w:w="100"/>
+              <w:bottom w:type="dxa" w:w="60"/>
+              <w:right w:type="dxa" w:w="100"/>
+            </w:tcMar>
+          </w:tcPr>
+          <w:p>
+            <w:r>
+              <w:t xml:space="preserve">Not started</w:t>
+            </w:r>
+          </w:p>
+        </w:tc>
+      </w:tr>
+      <w:tr>
+        <w:trPr>
+          <w:tblHeader w:val="false"/>
+        </w:trPr>
+        <w:tc>
+          <w:tcPr>
+            <w:tcW w:type="dxa" w:w="600"/>
+            <w:tcBorders>
+              <w:top w:val="single" w:color="BFBFBF" w:sz="4"/>
+              <w:left w:val="single" w:color="BFBFBF" w:sz="4"/>
+              <w:bottom w:val="single" w:color="BFBFBF" w:sz="4"/>
+              <w:right w:val="single" w:color="BFBFBF" w:sz="4"/>
+            </w:tcBorders>
+            <w:tcMar>
+              <w:top w:type="dxa" w:w="60"/>
+              <w:left w:type="dxa" w:w="100"/>
+              <w:bottom w:type="dxa" w:w="60"/>
+              <w:right w:type="dxa" w:w="100"/>
+            </w:tcMar>
+          </w:tcPr>
+          <w:p>
+            <w:r>
+              <w:t xml:space="preserve">16</w:t>
+            </w:r>
+          </w:p>
+        </w:tc>
+        <w:tc>
+          <w:tcPr>
+            <w:tcW w:type="dxa" w:w="5160"/>
+            <w:tcBorders>
+              <w:top w:val="single" w:color="BFBFBF" w:sz="4"/>
+              <w:left w:val="single" w:color="BFBFBF" w:sz="4"/>
+              <w:bottom w:val="single" w:color="BFBFBF" w:sz="4"/>
+              <w:right w:val="single" w:color="BFBFBF" w:sz="4"/>
+            </w:tcBorders>
+            <w:tcMar>
+              <w:top w:type="dxa" w:w="60"/>
+              <w:left w:type="dxa" w:w="100"/>
+              <w:bottom w:type="dxa" w:w="60"/>
+              <w:right w:type="dxa" w:w="100"/>
+            </w:tcMar>
+          </w:tcPr>
+          <w:p>
+            <w:r>
+              <w:t xml:space="preserve">Recorded videos replace placeholders, most-practiced lessons first</w:t>
+            </w:r>
+          </w:p>
+        </w:tc>
+        <w:tc>
+          <w:tcPr>
+            <w:tcW w:type="dxa" w:w="1600"/>
+            <w:tcBorders>
+              <w:top w:val="single" w:color="BFBFBF" w:sz="4"/>
+              <w:left w:val="single" w:color="BFBFBF" w:sz="4"/>
+              <w:bottom w:val="single" w:color="BFBFBF" w:sz="4"/>
+              <w:right w:val="single" w:color="BFBFBF" w:sz="4"/>
+            </w:tcBorders>
+            <w:tcMar>
+              <w:top w:type="dxa" w:w="60"/>
+              <w:left w:type="dxa" w:w="100"/>
+              <w:bottom w:type="dxa" w:w="60"/>
+              <w:right w:type="dxa" w:w="100"/>
+            </w:tcMar>
+          </w:tcPr>
+          <w:p>
+            <w:r>
+              <w:t xml:space="preserve">6</w:t>
+            </w:r>
+          </w:p>
+        </w:tc>
+        <w:tc>
+          <w:tcPr>
+            <w:tcW w:type="dxa" w:w="2000"/>
+            <w:tcBorders>
+              <w:top w:val="single" w:color="BFBFBF" w:sz="4"/>
+              <w:left w:val="single" w:color="BFBFBF" w:sz="4"/>
+              <w:bottom w:val="single" w:color="BFBFBF" w:sz="4"/>
+              <w:right w:val="single" w:color="BFBFBF" w:sz="4"/>
+            </w:tcBorders>
+            <w:tcMar>
+              <w:top w:type="dxa" w:w="60"/>
+              <w:left w:type="dxa" w:w="100"/>
+              <w:bottom w:type="dxa" w:w="60"/>
+              <w:right w:type="dxa" w:w="100"/>
+            </w:tcMar>
+          </w:tcPr>
+          <w:p>
+            <w:r>
+              <w:t xml:space="preserve">Not started</w:t>
+            </w:r>
+          </w:p>
+        </w:tc>
+      </w:tr>
+      <w:tr>
+        <w:trPr>
+          <w:tblHeader w:val="false"/>
+        </w:trPr>
+        <w:tc>
+          <w:tcPr>
+            <w:tcW w:type="dxa" w:w="600"/>
+            <w:tcBorders>
+              <w:top w:val="single" w:color="BFBFBF" w:sz="4"/>
+              <w:left w:val="single" w:color="BFBFBF" w:sz="4"/>
+              <w:bottom w:val="single" w:color="BFBFBF" w:sz="4"/>
+              <w:right w:val="single" w:color="BFBFBF" w:sz="4"/>
+            </w:tcBorders>
+            <w:tcMar>
+              <w:top w:type="dxa" w:w="60"/>
+              <w:left w:type="dxa" w:w="100"/>
+              <w:bottom w:type="dxa" w:w="60"/>
+              <w:right w:type="dxa" w:w="100"/>
+            </w:tcMar>
+          </w:tcPr>
+          <w:p>
+            <w:r>
+              <w:t xml:space="preserve">17</w:t>
+            </w:r>
+          </w:p>
+        </w:tc>
+        <w:tc>
+          <w:tcPr>
+            <w:tcW w:type="dxa" w:w="5160"/>
+            <w:tcBorders>
+              <w:top w:val="single" w:color="BFBFBF" w:sz="4"/>
+              <w:left w:val="single" w:color="BFBFBF" w:sz="4"/>
+              <w:bottom w:val="single" w:color="BFBFBF" w:sz="4"/>
+              <w:right w:val="single" w:color="BFBFBF" w:sz="4"/>
+            </w:tcBorders>
+            <w:tcMar>
+              <w:top w:type="dxa" w:w="60"/>
+              <w:left w:type="dxa" w:w="100"/>
+              <w:bottom w:type="dxa" w:w="60"/>
+              <w:right w:type="dxa" w:w="100"/>
+            </w:tcMar>
+          </w:tcPr>
+          <w:p>
+            <w:r>
+              <w:t xml:space="preserve">Teacher view: each lesson’s video and how many students watched it before practicing</w:t>
+            </w:r>
+          </w:p>
+        </w:tc>
+        <w:tc>
+          <w:tcPr>
+            <w:tcW w:type="dxa" w:w="1600"/>
+            <w:tcBorders>
+              <w:top w:val="single" w:color="BFBFBF" w:sz="4"/>
+              <w:left w:val="single" w:color="BFBFBF" w:sz="4"/>
+              <w:bottom w:val="single" w:color="BFBFBF" w:sz="4"/>
+              <w:right w:val="single" w:color="BFBFBF" w:sz="4"/>
+            </w:tcBorders>
+            <w:tcMar>
+              <w:top w:type="dxa" w:w="60"/>
+              <w:left w:type="dxa" w:w="100"/>
+              <w:bottom w:type="dxa" w:w="60"/>
+              <w:right w:type="dxa" w:w="100"/>
+            </w:tcMar>
+          </w:tcPr>
+          <w:p>
+            <w:r>
+              <w:t xml:space="preserve">6</w:t>
+            </w:r>
+          </w:p>
+        </w:tc>
+        <w:tc>
+          <w:tcPr>
+            <w:tcW w:type="dxa" w:w="2000"/>
+            <w:tcBorders>
+              <w:top w:val="single" w:color="BFBFBF" w:sz="4"/>
+              <w:left w:val="single" w:color="BFBFBF" w:sz="4"/>
+              <w:bottom w:val="single" w:color="BFBFBF" w:sz="4"/>
+              <w:right w:val="single" w:color="BFBFBF" w:sz="4"/>
+            </w:tcBorders>
+            <w:tcMar>
+              <w:top w:type="dxa" w:w="60"/>
+              <w:left w:type="dxa" w:w="100"/>
+              <w:bottom w:type="dxa" w:w="60"/>
+              <w:right w:type="dxa" w:w="100"/>
+            </w:tcMar>
+          </w:tcPr>
+          <w:p>
+            <w:r>
+              <w:t xml:space="preserve">Not started</w:t>
             </w:r>
           </w:p>
         </w:tc>

</xml_diff>